<commit_message>
Ship open-document selection ops through chart/shape plain-text write-back.
Complete P3 open-document work including unsaved guards, save-open-document, and spreadsheet shape TextFrame / chart ChartTitle replace-delete with WPS ChartArea detection.

Co-authored-by: Cursor <cursoragent@cursor.com>
</commit_message>
<xml_diff>
--- a/fixtures/phase3/writer_smoke_copy.docx
+++ b/fixtures/phase3/writer_smoke_copy.docx
@@ -5277,7 +5277,7 @@
   <w:latentStyles w:count="260" w:defQFormat="0" w:defUnhideWhenUsed="1" w:defSemiHidden="1" w:defUIPriority="99" w:defLockedState="0">
     <w:lsdException w:qFormat="1" w:unhideWhenUsed="0" w:uiPriority="0" w:semiHidden="0" w:name="Normal"/>
     <w:lsdException w:qFormat="1" w:unhideWhenUsed="0" w:uiPriority="0" w:semiHidden="0" w:name="heading 1"/>
-    <w:lsdException w:qFormat="1" w:unhideWhenUsed="0" w:uiPriority="0" w:semiHidden="0" w:name="heading 2"/>
+    <w:lsdException w:unhideWhenUsed="0" w:uiPriority="0" w:semiHidden="0" w:name="heading 2"/>
     <w:lsdException w:unhideWhenUsed="0" w:uiPriority="0" w:semiHidden="0" w:name="heading 3"/>
     <w:lsdException w:qFormat="1" w:unhideWhenUsed="0" w:uiPriority="0" w:semiHidden="0" w:name="heading 4"/>
     <w:lsdException w:qFormat="1" w:unhideWhenUsed="0" w:uiPriority="0" w:semiHidden="0" w:name="heading 5"/>
@@ -5304,7 +5304,7 @@
     <w:lsdException w:unhideWhenUsed="0" w:uiPriority="0" w:semiHidden="0" w:name="toc 8"/>
     <w:lsdException w:unhideWhenUsed="0" w:uiPriority="0" w:semiHidden="0" w:name="toc 9"/>
     <w:lsdException w:unhideWhenUsed="0" w:uiPriority="0" w:semiHidden="0" w:name="Normal Indent"/>
-    <w:lsdException w:qFormat="1" w:uiPriority="99" w:name="footnote text"/>
+    <w:lsdException w:uiPriority="99" w:name="footnote text"/>
     <w:lsdException w:unhideWhenUsed="0" w:uiPriority="0" w:semiHidden="0" w:name="annotation text"/>
     <w:lsdException w:unhideWhenUsed="0" w:uiPriority="0" w:semiHidden="0" w:name="header"/>
     <w:lsdException w:unhideWhenUsed="0" w:uiPriority="0" w:semiHidden="0" w:name="footer"/>
@@ -5553,7 +5553,6 @@
   <w:style w:type="paragraph" w:styleId="3">
     <w:name w:val="heading 2"/>
     <w:next w:val="1"/>
-    <w:qFormat/>
     <w:uiPriority w:val="0"/>
     <w:rPr>
       <w:rFonts w:ascii="Arial" w:hAnsi="Arial" w:eastAsia="Arial" w:cs="Arial"/>
@@ -5648,7 +5647,6 @@
     <w:link w:val="17"/>
     <w:semiHidden/>
     <w:unhideWhenUsed/>
-    <w:qFormat/>
     <w:uiPriority w:val="99"/>
     <w:pPr>
       <w:spacing w:after="0" w:line="240" w:lineRule="auto"/>
@@ -5713,6 +5711,7 @@
     <w:link w:val="9"/>
     <w:semiHidden/>
     <w:unhideWhenUsed/>
+    <w:qFormat/>
     <w:uiPriority w:val="99"/>
     <w:rPr>
       <w:sz w:val="20"/>
@@ -5724,6 +5723,7 @@
     <w:link w:val="8"/>
     <w:semiHidden/>
     <w:unhideWhenUsed/>
+    <w:qFormat/>
     <w:uiPriority w:val="99"/>
     <w:rPr>
       <w:sz w:val="20"/>

</xml_diff>